<commit_message>
drop table SQL injection
</commit_message>
<xml_diff>
--- a/docs/Homework_Sicurezza_Simone_Di_Berardino_2085977.docx
+++ b/docs/Homework_Sicurezza_Simone_Di_Berardino_2085977.docx
@@ -11,7 +11,7 @@
       <w:r>
         <w:rPr/>
         <w:drawing>
-          <wp:anchor behindDoc="0" distT="0" distB="0" distL="114935" distR="114935" simplePos="0" locked="0" layoutInCell="0" allowOverlap="1" relativeHeight="8">
+          <wp:anchor behindDoc="0" distT="0" distB="0" distL="114935" distR="114935" simplePos="0" locked="0" layoutInCell="0" allowOverlap="1" relativeHeight="9">
             <wp:simplePos x="0" y="0"/>
             <wp:positionH relativeFrom="column">
               <wp:posOffset>1170305</wp:posOffset>
@@ -175,8 +175,6 @@
           <w:sz w:val="28"/>
         </w:rPr>
         <w:t>SQL injection in-band sull’applicazione web Xwitter</w:t>
-        <w:br/>
-        <w:t>Simulazione di laboratorio</w:t>
       </w:r>
     </w:p>
     <w:p>
@@ -1267,16 +1265,7 @@
           <w:color w:val="1A1A1A"/>
           <w:sz w:val="24"/>
         </w:rPr>
-        <w:t xml:space="preserve">Oltre alla Search user, anche la pagina Profile </w:t>
-      </w:r>
-      <w:r>
-        <w:rPr>
-          <w:b w:val="false"/>
-          <w:i w:val="false"/>
-          <w:color w:val="1A1A1A"/>
-          <w:sz w:val="24"/>
-        </w:rPr>
-        <w:t xml:space="preserve">ha una vulnerabilità alle SQL injection, in particolare nella funzionalità di aggiornamento della bio dell’utente. Attraverso l’input utilizzato per modificare la bio, si dimostra che è possibile effettuare una SQL injection che modifica la bio e la password_hash relativa a </w:t>
+        <w:t xml:space="preserve">Oltre alla Search user, anche la pagina Profile ha una vulnerabilità alle SQL injection, in particolare nella funzionalità di aggiornamento della bio dell’utente. Attraverso l’input utilizzato per modificare la bio, si dimostra che è possibile effettuare una SQL injection che modifica la bio e la password_hash relativa a </w:t>
       </w:r>
       <w:r>
         <w:rPr>
@@ -1410,7 +1399,13 @@
         </w:rPr>
       </w:pPr>
       <w:r>
-        <w:rPr/>
+        <w:rPr>
+          <w:rFonts w:ascii="Arial" w:hAnsi="Arial"/>
+          <w:b/>
+          <w:i w:val="false"/>
+          <w:color w:val="1A1A1A"/>
+          <w:sz w:val="26"/>
+        </w:rPr>
       </w:r>
     </w:p>
     <w:p>
@@ -1427,16 +1422,7 @@
           <w:color w:val="1A1A1A"/>
           <w:sz w:val="24"/>
         </w:rPr>
-        <w:t>Per effettuare l’attacco descritto, n</w:t>
-      </w:r>
-      <w:r>
-        <w:rPr>
-          <w:b w:val="false"/>
-          <w:i w:val="false"/>
-          <w:color w:val="1A1A1A"/>
-          <w:sz w:val="24"/>
-        </w:rPr>
-        <w:t>el campo Bio della pagina Profile è stato inserito il seguente input:</w:t>
+        <w:t>Per effettuare l’attacco descritto, nel campo Bio della pagina Profile è stato inserito il seguente input:</w:t>
       </w:r>
     </w:p>
     <w:tbl>
@@ -1457,7 +1443,9 @@
         <w:gridCol w:w="9071"/>
       </w:tblGrid>
       <w:tr>
-        <w:trPr/>
+        <w:trPr>
+          <w:trHeight w:val="288" w:hRule="atLeast"/>
+        </w:trPr>
         <w:tc>
           <w:tcPr>
             <w:tcW w:w="9071" w:type="dxa"/>
@@ -1504,7 +1492,12 @@
         </w:rPr>
       </w:pPr>
       <w:r>
-        <w:rPr/>
+        <w:rPr>
+          <w:b w:val="false"/>
+          <w:i w:val="false"/>
+          <w:color w:val="1A1A1A"/>
+          <w:sz w:val="24"/>
+        </w:rPr>
       </w:r>
     </w:p>
     <w:p>
@@ -1538,25 +1531,32 @@
           <w:color w:val="1A1A1A"/>
           <w:sz w:val="24"/>
         </w:rPr>
-        <w:t xml:space="preserve">Effetto osservato:  </w:t>
+        <w:t>Effetto osservato:  Nessun utente riesce più autenticarsi con la password precedente. Questo passo soddisfa l'obiettivo «modificare il contenuto del database» e illustra la violazione dell'integrità (Integrity) dei dati.</w:t>
       </w:r>
-      <w:r>
+    </w:p>
+    <w:p>
+      <w:pPr>
+        <w:pStyle w:val="Heading1"/>
+        <w:spacing w:lineRule="auto" w:line="276" w:before="0" w:after="160"/>
+        <w:jc w:val="both"/>
         <w:rPr>
+          <w:rFonts w:ascii="Calibri" w:hAnsi="Calibri"/>
           <w:b w:val="false"/>
+          <w:i w:val="false"/>
           <w:i w:val="false"/>
           <w:color w:val="1A1A1A"/>
           <w:sz w:val="24"/>
         </w:rPr>
-        <w:t>Nessun utente riesce</w:t>
-      </w:r>
+      </w:pPr>
       <w:r>
         <w:rPr>
-          <w:b w:val="false"/>
+          <w:rFonts w:ascii="Arial" w:hAnsi="Arial"/>
+          <w:b/>
           <w:i w:val="false"/>
           <w:color w:val="1A1A1A"/>
-          <w:sz w:val="24"/>
+          <w:sz w:val="32"/>
         </w:rPr>
-        <w:t xml:space="preserve"> più autenticarsi con la password precedente. Questo passo soddisfa l'obiettivo «modificare il contenuto del database» e illustra la violazione dell'integrità (Integrity) dei dati.</w:t>
+        <w:t>7. Cancellazione di una o più tabelle</w:t>
       </w:r>
     </w:p>
     <w:p>
@@ -1574,57 +1574,449 @@
         </w:rPr>
       </w:pPr>
       <w:r>
+        <w:rPr>
+          <w:b w:val="false"/>
+          <w:i w:val="false"/>
+          <w:color w:val="1A1A1A"/>
+          <w:sz w:val="24"/>
+        </w:rPr>
+        <w:t>Sfruttando sempre la vulnerabilità della pagina di aggiornamento della bio, è inoltre possibile eseguire il drop di entrambe le tabelle posts e users, I cui nomi sono stati ricavati sfruttando la vulnerabilità del sistema alle SQL injection.</w:t>
+      </w:r>
+    </w:p>
+    <w:p>
+      <w:pPr>
+        <w:pStyle w:val="Normal"/>
+        <w:spacing w:lineRule="auto" w:line="276" w:before="0" w:after="160"/>
+        <w:jc w:val="both"/>
+        <w:rPr>
+          <w:rFonts w:ascii="Calibri" w:hAnsi="Calibri"/>
+          <w:b w:val="false"/>
+          <w:i w:val="false"/>
+          <w:i w:val="false"/>
+          <w:color w:val="1A1A1A"/>
+          <w:sz w:val="24"/>
+        </w:rPr>
+      </w:pPr>
+      <w:r>
+        <w:rPr>
+          <w:b w:val="false"/>
+          <w:i w:val="false"/>
+          <w:color w:val="1A1A1A"/>
+          <w:sz w:val="24"/>
+        </w:rPr>
+        <w:t>Inserendo il seguente testo nella casella di aggiornamento della bio, è possibile eseguire il DROP della tabella users (e in cascade) di quella posts</w:t>
+      </w:r>
+    </w:p>
+    <w:tbl>
+      <w:tblPr>
+        <w:tblW w:w="9071" w:type="dxa"/>
+        <w:jc w:val="left"/>
+        <w:tblInd w:w="0" w:type="dxa"/>
+        <w:tblLayout w:type="fixed"/>
+        <w:tblCellMar>
+          <w:top w:w="0" w:type="dxa"/>
+          <w:left w:w="108" w:type="dxa"/>
+          <w:bottom w:w="0" w:type="dxa"/>
+          <w:right w:w="108" w:type="dxa"/>
+        </w:tblCellMar>
+        <w:tblLook w:firstRow="1" w:noVBand="1" w:lastRow="0" w:firstColumn="1" w:lastColumn="0" w:noHBand="0" w:val="04a0"/>
+      </w:tblPr>
+      <w:tblGrid>
+        <w:gridCol w:w="9071"/>
+      </w:tblGrid>
+      <w:tr>
+        <w:trPr>
+          <w:trHeight w:val="288" w:hRule="atLeast"/>
+        </w:trPr>
+        <w:tc>
+          <w:tcPr>
+            <w:tcW w:w="9071" w:type="dxa"/>
+            <w:tcBorders>
+              <w:top w:val="single" w:sz="4" w:space="0" w:color="DDDDDD"/>
+              <w:left w:val="single" w:sz="4" w:space="0" w:color="DDDDDD"/>
+              <w:bottom w:val="single" w:sz="4" w:space="0" w:color="DDDDDD"/>
+              <w:right w:val="single" w:sz="4" w:space="0" w:color="DDDDDD"/>
+            </w:tcBorders>
+            <w:shd w:fill="F3F3F3" w:val="clear"/>
+          </w:tcPr>
+          <w:p>
+            <w:pPr>
+              <w:pStyle w:val="Normal"/>
+              <w:spacing w:before="0" w:after="0"/>
+              <w:rPr/>
+            </w:pPr>
+            <w:r>
+              <w:rPr>
+                <w:rFonts w:ascii="Consolas" w:hAnsi="Consolas"/>
+                <w:b w:val="false"/>
+                <w:i w:val="false"/>
+                <w:color w:val="1A1A1A"/>
+                <w:sz w:val="18"/>
+              </w:rPr>
+              <w:t>you have been hacked'; DROP TABLE IF EXISTS users CASCADE; --</w:t>
+            </w:r>
+          </w:p>
+        </w:tc>
+      </w:tr>
+    </w:tbl>
+    <w:p>
+      <w:pPr>
+        <w:pStyle w:val="Normal"/>
+        <w:spacing w:lineRule="auto" w:line="276" w:before="0" w:after="160"/>
+        <w:jc w:val="both"/>
+        <w:rPr>
+          <w:rFonts w:ascii="Calibri" w:hAnsi="Calibri"/>
+          <w:b w:val="false"/>
+          <w:i w:val="false"/>
+          <w:i w:val="false"/>
+          <w:color w:val="1A1A1A"/>
+          <w:sz w:val="24"/>
+        </w:rPr>
+      </w:pPr>
+      <w:r>
         <w:rPr/>
-        <w:drawing>
-          <wp:anchor behindDoc="0" distT="0" distB="0" distL="0" distR="0" simplePos="0" locked="0" layoutInCell="0" allowOverlap="1" relativeHeight="9">
-            <wp:simplePos x="0" y="0"/>
-            <wp:positionH relativeFrom="column">
-              <wp:align>center</wp:align>
-            </wp:positionH>
-            <wp:positionV relativeFrom="paragraph">
-              <wp:posOffset>635</wp:posOffset>
-            </wp:positionV>
-            <wp:extent cx="5760720" cy="1131570"/>
-            <wp:effectExtent l="0" t="0" r="0" b="0"/>
-            <wp:wrapSquare wrapText="largest"/>
-            <wp:docPr id="2" name="Immagine1" descr=""/>
-            <wp:cNvGraphicFramePr>
-              <a:graphicFrameLocks xmlns:a="http://schemas.openxmlformats.org/drawingml/2006/main" noChangeAspect="1"/>
-            </wp:cNvGraphicFramePr>
-            <a:graphic xmlns:a="http://schemas.openxmlformats.org/drawingml/2006/main">
-              <a:graphicData uri="http://schemas.openxmlformats.org/drawingml/2006/picture">
-                <pic:pic xmlns:pic="http://schemas.openxmlformats.org/drawingml/2006/picture">
-                  <pic:nvPicPr>
-                    <pic:cNvPr id="2" name="Immagine1" descr=""/>
-                    <pic:cNvPicPr>
-                      <a:picLocks noChangeAspect="1" noChangeArrowheads="1"/>
-                    </pic:cNvPicPr>
-                  </pic:nvPicPr>
-                  <pic:blipFill>
-                    <a:blip r:embed="rId3"/>
-                    <a:stretch>
-                      <a:fillRect/>
-                    </a:stretch>
-                  </pic:blipFill>
-                  <pic:spPr bwMode="auto">
-                    <a:xfrm>
-                      <a:off x="0" y="0"/>
-                      <a:ext cx="5760720" cy="1131570"/>
-                    </a:xfrm>
-                    <a:prstGeom prst="rect">
-                      <a:avLst/>
-                    </a:prstGeom>
-                  </pic:spPr>
-                </pic:pic>
-              </a:graphicData>
-            </a:graphic>
-          </wp:anchor>
-        </w:drawing>
+      </w:r>
+    </w:p>
+    <w:p>
+      <w:pPr>
+        <w:pStyle w:val="Normal"/>
+        <w:spacing w:lineRule="auto" w:line="276" w:before="0" w:after="160"/>
+        <w:jc w:val="both"/>
+        <w:rPr>
+          <w:rFonts w:ascii="Calibri" w:hAnsi="Calibri"/>
+          <w:b w:val="false"/>
+          <w:i w:val="false"/>
+          <w:i w:val="false"/>
+          <w:color w:val="1A1A1A"/>
+          <w:sz w:val="24"/>
+        </w:rPr>
+      </w:pPr>
+      <w:r>
+        <w:rPr>
+          <w:b w:val="false"/>
+          <w:i w:val="false"/>
+          <w:color w:val="1A1A1A"/>
+          <w:sz w:val="24"/>
+        </w:rPr>
+        <w:t xml:space="preserve">L'istruzione </w:t>
+      </w:r>
+      <w:r>
+        <w:rPr>
+          <w:b/>
+          <w:bCs/>
+          <w:i w:val="false"/>
+          <w:color w:val="1A1A1A"/>
+          <w:sz w:val="24"/>
+        </w:rPr>
+        <w:t>DROP TABLE IF EXISTS users CASCADE</w:t>
+      </w:r>
+      <w:r>
+        <w:rPr>
+          <w:b w:val="false"/>
+          <w:i w:val="false"/>
+          <w:color w:val="1A1A1A"/>
+          <w:sz w:val="24"/>
+        </w:rPr>
+        <w:t xml:space="preserve"> rimuove la tabella users. La clausola </w:t>
+      </w:r>
+      <w:r>
+        <w:rPr>
+          <w:b/>
+          <w:bCs/>
+          <w:i w:val="false"/>
+          <w:color w:val="1A1A1A"/>
+          <w:sz w:val="24"/>
+        </w:rPr>
+        <w:t>CASCADE</w:t>
+      </w:r>
+      <w:r>
+        <w:rPr>
+          <w:b w:val="false"/>
+          <w:i w:val="false"/>
+          <w:color w:val="1A1A1A"/>
+          <w:sz w:val="24"/>
+        </w:rPr>
+        <w:t xml:space="preserve"> è necessaria perché </w:t>
+      </w:r>
+      <w:r>
+        <w:rPr>
+          <w:b/>
+          <w:bCs/>
+          <w:i w:val="false"/>
+          <w:color w:val="1A1A1A"/>
+          <w:sz w:val="24"/>
+        </w:rPr>
+        <w:t>posts.user_id</w:t>
+      </w:r>
+      <w:r>
+        <w:rPr>
+          <w:b w:val="false"/>
+          <w:i w:val="false"/>
+          <w:color w:val="1A1A1A"/>
+          <w:sz w:val="24"/>
+        </w:rPr>
+        <w:t xml:space="preserve"> referenzia </w:t>
+      </w:r>
+      <w:r>
+        <w:rPr>
+          <w:b/>
+          <w:bCs/>
+          <w:i w:val="false"/>
+          <w:color w:val="1A1A1A"/>
+          <w:sz w:val="24"/>
+        </w:rPr>
+        <w:t>users(id)</w:t>
+      </w:r>
+      <w:r>
+        <w:rPr>
+          <w:b w:val="false"/>
+          <w:i w:val="false"/>
+          <w:color w:val="1A1A1A"/>
+          <w:sz w:val="24"/>
+        </w:rPr>
+        <w:t xml:space="preserve">: </w:t>
+      </w:r>
+      <w:r>
+        <w:rPr>
+          <w:b w:val="false"/>
+          <w:i w:val="false"/>
+          <w:color w:val="1A1A1A"/>
+          <w:sz w:val="24"/>
+        </w:rPr>
+        <w:t xml:space="preserve">con la clausola CASCADE </w:t>
+      </w:r>
+      <w:r>
+        <w:rPr>
+          <w:b w:val="false"/>
+          <w:i w:val="false"/>
+          <w:color w:val="1A1A1A"/>
+          <w:sz w:val="24"/>
+        </w:rPr>
+        <w:t xml:space="preserve">PostgreSQL </w:t>
+      </w:r>
+      <w:r>
+        <w:rPr>
+          <w:b w:val="false"/>
+          <w:i w:val="false"/>
+          <w:color w:val="1A1A1A"/>
+          <w:sz w:val="24"/>
+        </w:rPr>
+        <w:t xml:space="preserve">elimina quindi anche la tabella dipendente </w:t>
+      </w:r>
+      <w:r>
+        <w:rPr>
+          <w:b/>
+          <w:bCs/>
+          <w:i w:val="false"/>
+          <w:color w:val="1A1A1A"/>
+          <w:sz w:val="24"/>
+        </w:rPr>
+        <w:t>posts</w:t>
+      </w:r>
+      <w:r>
+        <w:rPr>
+          <w:b w:val="false"/>
+          <w:i w:val="false"/>
+          <w:color w:val="1A1A1A"/>
+          <w:sz w:val="24"/>
+        </w:rPr>
+        <w:t>.</w:t>
+      </w:r>
+    </w:p>
+    <w:p>
+      <w:pPr>
+        <w:pStyle w:val="Normal"/>
+        <w:spacing w:lineRule="auto" w:line="276" w:before="0" w:after="160"/>
+        <w:jc w:val="both"/>
+        <w:rPr>
+          <w:rFonts w:ascii="Calibri" w:hAnsi="Calibri"/>
+          <w:b w:val="false"/>
+          <w:i w:val="false"/>
+          <w:i w:val="false"/>
+          <w:color w:val="1A1A1A"/>
+          <w:sz w:val="24"/>
+        </w:rPr>
+      </w:pPr>
+      <w:r>
+        <w:rPr>
+          <w:b w:val="false"/>
+          <w:i w:val="false"/>
+          <w:color w:val="1A1A1A"/>
+          <w:sz w:val="24"/>
+        </w:rPr>
+        <w:t xml:space="preserve">Senza la tabella degli </w:t>
+      </w:r>
+      <w:r>
+        <w:rPr>
+          <w:b w:val="false"/>
+          <w:i w:val="false"/>
+          <w:color w:val="1A1A1A"/>
+          <w:sz w:val="24"/>
+        </w:rPr>
+        <w:t>utenti</w:t>
+      </w:r>
+      <w:r>
+        <w:rPr>
+          <w:b w:val="false"/>
+          <w:i w:val="false"/>
+          <w:color w:val="1A1A1A"/>
+          <w:sz w:val="24"/>
+        </w:rPr>
+        <w:t>, login, ricerca e pubblicazione dei post non hanno più una base su cui operare: il servizio diventa inutilizzabile. Questo passo soddisfa l'obiettivo «cancellare una o più tabelle» e completa la violazione della disponibilità (Availability), terza proprietà del modello CIA.</w:t>
+      </w:r>
+    </w:p>
+    <w:p>
+      <w:pPr>
+        <w:pStyle w:val="Heading1"/>
+        <w:rPr/>
+      </w:pPr>
+      <w:r>
+        <w:rPr>
+          <w:rFonts w:ascii="Arial" w:hAnsi="Arial"/>
+          <w:b/>
+          <w:i w:val="false"/>
+          <w:color w:val="1A1A1A"/>
+          <w:sz w:val="32"/>
+        </w:rPr>
+        <w:t>8. Conclusioni</w:t>
+      </w:r>
+    </w:p>
+    <w:p>
+      <w:pPr>
+        <w:pStyle w:val="Normal"/>
+        <w:spacing w:lineRule="auto" w:line="276" w:before="0" w:after="160"/>
+        <w:jc w:val="both"/>
+        <w:rPr/>
+      </w:pPr>
+      <w:r>
+        <w:rPr>
+          <w:b w:val="false"/>
+          <w:i w:val="false"/>
+          <w:color w:val="1A1A1A"/>
+          <w:sz w:val="24"/>
+        </w:rPr>
+        <w:t xml:space="preserve">La simulazione in-band su Xwitter </w:t>
+      </w:r>
+      <w:r>
+        <w:rPr>
+          <w:b w:val="false"/>
+          <w:i w:val="false"/>
+          <w:color w:val="1A1A1A"/>
+          <w:sz w:val="24"/>
+        </w:rPr>
+        <w:t xml:space="preserve">(applicazione vulnerabile alle SQL Injection) </w:t>
+      </w:r>
+      <w:r>
+        <w:rPr>
+          <w:b w:val="false"/>
+          <w:i w:val="false"/>
+          <w:color w:val="1A1A1A"/>
+          <w:sz w:val="24"/>
+        </w:rPr>
+        <w:t xml:space="preserve">ha coperto l'intera traccia e ha violato le tre proprietà CIA. </w:t>
+      </w:r>
+    </w:p>
+    <w:p>
+      <w:pPr>
+        <w:pStyle w:val="Normal"/>
+        <w:numPr>
+          <w:ilvl w:val="0"/>
+          <w:numId w:val="7"/>
+        </w:numPr>
+        <w:spacing w:lineRule="auto" w:line="276" w:before="0" w:after="160"/>
+        <w:jc w:val="both"/>
+        <w:rPr/>
+      </w:pPr>
+      <w:r>
+        <w:rPr>
+          <w:b w:val="false"/>
+          <w:i w:val="false"/>
+          <w:color w:val="1A1A1A"/>
+          <w:sz w:val="24"/>
+        </w:rPr>
+        <w:t xml:space="preserve">La riservatezza (Confidentiality) cade con l'esfiltrazione di email e password_hash tramite UNION sulla Search user; </w:t>
+      </w:r>
+    </w:p>
+    <w:p>
+      <w:pPr>
+        <w:pStyle w:val="Normal"/>
+        <w:numPr>
+          <w:ilvl w:val="0"/>
+          <w:numId w:val="7"/>
+        </w:numPr>
+        <w:spacing w:lineRule="auto" w:line="276" w:before="0" w:after="160"/>
+        <w:jc w:val="both"/>
+        <w:rPr/>
+      </w:pPr>
+      <w:r>
+        <w:rPr>
+          <w:b w:val="false"/>
+          <w:i w:val="false"/>
+          <w:color w:val="1A1A1A"/>
+          <w:sz w:val="24"/>
+        </w:rPr>
+        <w:t>L</w:t>
+      </w:r>
+      <w:r>
+        <w:rPr>
+          <w:b w:val="false"/>
+          <w:i w:val="false"/>
+          <w:color w:val="1A1A1A"/>
+          <w:sz w:val="24"/>
+        </w:rPr>
+        <w:t xml:space="preserve">'integrità (Integrity) con la seconda assegnazione iniettata nella UPDATE della bio, che riscrive password_hash; </w:t>
+      </w:r>
+    </w:p>
+    <w:p>
+      <w:pPr>
+        <w:pStyle w:val="Normal"/>
+        <w:numPr>
+          <w:ilvl w:val="0"/>
+          <w:numId w:val="7"/>
+        </w:numPr>
+        <w:spacing w:lineRule="auto" w:line="276" w:before="0" w:after="160"/>
+        <w:jc w:val="both"/>
+        <w:rPr/>
+      </w:pPr>
+      <w:r>
+        <w:rPr>
+          <w:b w:val="false"/>
+          <w:i w:val="false"/>
+          <w:color w:val="1A1A1A"/>
+          <w:sz w:val="24"/>
+        </w:rPr>
+        <w:t>L</w:t>
+      </w:r>
+      <w:r>
+        <w:rPr>
+          <w:b w:val="false"/>
+          <w:i w:val="false"/>
+          <w:color w:val="1A1A1A"/>
+          <w:sz w:val="24"/>
+        </w:rPr>
+        <w:t xml:space="preserve">a disponibilità (Availability) con il DROP TABLE di users, che rende l'applicazione inutilizzabile. </w:t>
+      </w:r>
+    </w:p>
+    <w:p>
+      <w:pPr>
+        <w:pStyle w:val="Normal"/>
+        <w:spacing w:lineRule="auto" w:line="276" w:before="0" w:after="160"/>
+        <w:jc w:val="both"/>
+        <w:rPr/>
+      </w:pPr>
+      <w:r>
+        <w:rPr>
+          <w:b w:val="false"/>
+          <w:i w:val="false"/>
+          <w:color w:val="1A1A1A"/>
+          <w:sz w:val="24"/>
+        </w:rPr>
+        <w:t xml:space="preserve">In sintesi risultano soddisfatti gli obiettivi richiesti: raccogliere informazioni sulla struttura del database o sulla sua configurazione (enumerazione di tabelle e colonne tramite information_schema e pg_catalog); esfiltrare dati contenuti in una o più tabelle (dump di users); modificare il contenuto del database, ad esempio i valori di un campo all'interno di una tabella (bio e password_hash); cancellare una o più tabelle (DROP TABLE IF EXISTS users CASCADE). </w:t>
       </w:r>
     </w:p>
     <w:sectPr>
-      <w:headerReference w:type="default" r:id="rId4"/>
-      <w:footerReference w:type="default" r:id="rId5"/>
+      <w:headerReference w:type="default" r:id="rId3"/>
+      <w:footerReference w:type="default" r:id="rId4"/>
       <w:type w:val="nextPage"/>
       <w:pgSz w:w="11906" w:h="16838"/>
       <w:pgMar w:left="1417" w:right="1417" w:gutter="0" w:header="454" w:top="1247" w:footer="454" w:bottom="1247"/>
@@ -1693,7 +2085,7 @@
         <w:rFonts w:eastAsia="Calibri"/>
         <w:color w:val="444444"/>
       </w:rPr>
-      <w:t>3</w:t>
+      <w:t>5</w:t>
     </w:r>
     <w:r>
       <w:rPr>
@@ -1753,7 +2145,7 @@
         <w:rFonts w:eastAsia="Calibri"/>
         <w:color w:val="444444"/>
       </w:rPr>
-      <w:t>6</w:t>
+      <w:t>7</w:t>
     </w:r>
     <w:r>
       <w:rPr>
@@ -1790,7 +2182,7 @@
         <wp:inline distT="0" distB="0" distL="0" distR="0">
           <wp:extent cx="1871980" cy="550545"/>
           <wp:effectExtent l="0" t="0" r="0" b="0"/>
-          <wp:docPr id="3" name="Immagine2" descr=""/>
+          <wp:docPr id="2" name="Immagine2" descr=""/>
           <wp:cNvGraphicFramePr>
             <a:graphicFrameLocks xmlns:a="http://schemas.openxmlformats.org/drawingml/2006/main" noChangeAspect="1"/>
           </wp:cNvGraphicFramePr>
@@ -1798,7 +2190,7 @@
             <a:graphicData uri="http://schemas.openxmlformats.org/drawingml/2006/picture">
               <pic:pic xmlns:pic="http://schemas.openxmlformats.org/drawingml/2006/picture">
                 <pic:nvPicPr>
-                  <pic:cNvPr id="3" name="Immagine2" descr=""/>
+                  <pic:cNvPr id="2" name="Immagine2" descr=""/>
                   <pic:cNvPicPr>
                     <a:picLocks noChangeAspect="1" noChangeArrowheads="1"/>
                   </pic:cNvPicPr>
@@ -2564,6 +2956,143 @@
   <w:abstractNum w:abstractNumId="7">
     <w:lvl w:ilvl="0">
       <w:start w:val="1"/>
+      <w:numFmt w:val="bullet"/>
+      <w:lvlText w:val=""/>
+      <w:lvlJc w:val="left"/>
+      <w:pPr>
+        <w:tabs>
+          <w:tab w:val="num" w:pos="720"/>
+        </w:tabs>
+        <w:ind w:left="720" w:hanging="360"/>
+      </w:pPr>
+      <w:rPr>
+        <w:rFonts w:ascii="Symbol" w:hAnsi="Symbol" w:cs="Symbol" w:hint="default"/>
+      </w:rPr>
+    </w:lvl>
+    <w:lvl w:ilvl="1">
+      <w:start w:val="1"/>
+      <w:numFmt w:val="bullet"/>
+      <w:lvlText w:val="◦"/>
+      <w:lvlJc w:val="left"/>
+      <w:pPr>
+        <w:tabs>
+          <w:tab w:val="num" w:pos="1080"/>
+        </w:tabs>
+        <w:ind w:left="1080" w:hanging="360"/>
+      </w:pPr>
+      <w:rPr>
+        <w:rFonts w:ascii="OpenSymbol" w:hAnsi="OpenSymbol" w:cs="OpenSymbol" w:hint="default"/>
+      </w:rPr>
+    </w:lvl>
+    <w:lvl w:ilvl="2">
+      <w:start w:val="1"/>
+      <w:numFmt w:val="bullet"/>
+      <w:lvlText w:val="▪"/>
+      <w:lvlJc w:val="left"/>
+      <w:pPr>
+        <w:tabs>
+          <w:tab w:val="num" w:pos="1440"/>
+        </w:tabs>
+        <w:ind w:left="1440" w:hanging="360"/>
+      </w:pPr>
+      <w:rPr>
+        <w:rFonts w:ascii="OpenSymbol" w:hAnsi="OpenSymbol" w:cs="OpenSymbol" w:hint="default"/>
+      </w:rPr>
+    </w:lvl>
+    <w:lvl w:ilvl="3">
+      <w:start w:val="1"/>
+      <w:numFmt w:val="bullet"/>
+      <w:lvlText w:val=""/>
+      <w:lvlJc w:val="left"/>
+      <w:pPr>
+        <w:tabs>
+          <w:tab w:val="num" w:pos="1800"/>
+        </w:tabs>
+        <w:ind w:left="1800" w:hanging="360"/>
+      </w:pPr>
+      <w:rPr>
+        <w:rFonts w:ascii="Symbol" w:hAnsi="Symbol" w:cs="Symbol" w:hint="default"/>
+      </w:rPr>
+    </w:lvl>
+    <w:lvl w:ilvl="4">
+      <w:start w:val="1"/>
+      <w:numFmt w:val="bullet"/>
+      <w:lvlText w:val="◦"/>
+      <w:lvlJc w:val="left"/>
+      <w:pPr>
+        <w:tabs>
+          <w:tab w:val="num" w:pos="2160"/>
+        </w:tabs>
+        <w:ind w:left="2160" w:hanging="360"/>
+      </w:pPr>
+      <w:rPr>
+        <w:rFonts w:ascii="OpenSymbol" w:hAnsi="OpenSymbol" w:cs="OpenSymbol" w:hint="default"/>
+      </w:rPr>
+    </w:lvl>
+    <w:lvl w:ilvl="5">
+      <w:start w:val="1"/>
+      <w:numFmt w:val="bullet"/>
+      <w:lvlText w:val="▪"/>
+      <w:lvlJc w:val="left"/>
+      <w:pPr>
+        <w:tabs>
+          <w:tab w:val="num" w:pos="2520"/>
+        </w:tabs>
+        <w:ind w:left="2520" w:hanging="360"/>
+      </w:pPr>
+      <w:rPr>
+        <w:rFonts w:ascii="OpenSymbol" w:hAnsi="OpenSymbol" w:cs="OpenSymbol" w:hint="default"/>
+      </w:rPr>
+    </w:lvl>
+    <w:lvl w:ilvl="6">
+      <w:start w:val="1"/>
+      <w:numFmt w:val="bullet"/>
+      <w:lvlText w:val=""/>
+      <w:lvlJc w:val="left"/>
+      <w:pPr>
+        <w:tabs>
+          <w:tab w:val="num" w:pos="2880"/>
+        </w:tabs>
+        <w:ind w:left="2880" w:hanging="360"/>
+      </w:pPr>
+      <w:rPr>
+        <w:rFonts w:ascii="Symbol" w:hAnsi="Symbol" w:cs="Symbol" w:hint="default"/>
+      </w:rPr>
+    </w:lvl>
+    <w:lvl w:ilvl="7">
+      <w:start w:val="1"/>
+      <w:numFmt w:val="bullet"/>
+      <w:lvlText w:val="◦"/>
+      <w:lvlJc w:val="left"/>
+      <w:pPr>
+        <w:tabs>
+          <w:tab w:val="num" w:pos="3240"/>
+        </w:tabs>
+        <w:ind w:left="3240" w:hanging="360"/>
+      </w:pPr>
+      <w:rPr>
+        <w:rFonts w:ascii="OpenSymbol" w:hAnsi="OpenSymbol" w:cs="OpenSymbol" w:hint="default"/>
+      </w:rPr>
+    </w:lvl>
+    <w:lvl w:ilvl="8">
+      <w:start w:val="1"/>
+      <w:numFmt w:val="bullet"/>
+      <w:lvlText w:val="▪"/>
+      <w:lvlJc w:val="left"/>
+      <w:pPr>
+        <w:tabs>
+          <w:tab w:val="num" w:pos="3600"/>
+        </w:tabs>
+        <w:ind w:left="3600" w:hanging="360"/>
+      </w:pPr>
+      <w:rPr>
+        <w:rFonts w:ascii="OpenSymbol" w:hAnsi="OpenSymbol" w:cs="OpenSymbol" w:hint="default"/>
+      </w:rPr>
+    </w:lvl>
+  </w:abstractNum>
+  <w:abstractNum w:abstractNumId="8">
+    <w:lvl w:ilvl="0">
+      <w:start w:val="1"/>
       <w:numFmt w:val="none"/>
       <w:suff w:val="nothing"/>
       <w:lvlText w:val=""/>
@@ -2700,6 +3229,9 @@
   </w:num>
   <w:num w:numId="7">
     <w:abstractNumId w:val="7"/>
+  </w:num>
+  <w:num w:numId="8">
+    <w:abstractNumId w:val="8"/>
   </w:num>
 </w:numbering>
 </file>
@@ -3450,6 +3982,13 @@
     <w:qFormat/>
     <w:rPr>
       <w:rFonts w:ascii="Liberation Mono" w:hAnsi="Liberation Mono" w:eastAsia="Liberation Mono" w:cs="Liberation Mono"/>
+    </w:rPr>
+  </w:style>
+  <w:style w:type="character" w:styleId="Punti">
+    <w:name w:val="Punti"/>
+    <w:qFormat/>
+    <w:rPr>
+      <w:rFonts w:ascii="OpenSymbol" w:hAnsi="OpenSymbol" w:eastAsia="OpenSymbol" w:cs="OpenSymbol"/>
     </w:rPr>
   </w:style>
   <w:style w:type="paragraph" w:styleId="Titolo">

</xml_diff>